<commit_message>
feat: complete BCS753 presentation, white-background diagrams, centered page footers, and official cover page format
</commit_message>
<xml_diff>
--- a/SUBMISSION/Mini_Project_Report_Dev_Rana_Kaila.docx
+++ b/SUBMISSION/Mini_Project_Report_Dev_Rana_Kaila.docx
@@ -4,7 +4,30 @@
   <w:body>
     <w:p>
       <w:pPr>
-        <w:spacing w:before="0" w:after="240" w:line="276" w:lineRule="auto"/>
+        <w:spacing w:before="240" w:after="120" w:line="276" w:lineRule="auto"/>
+        <w:jc w:val="center"/>
+      </w:pPr>
+      <w:r>
+        <w:rPr>
+          <w:rFonts w:ascii="Times New Roman" w:hAnsi="Times New Roman"/>
+          <w:b/>
+          <w:color w:val="000000"/>
+          <w:sz w:val="27"/>
+        </w:rPr>
+        <w:t>DUAL-STREAM SPATIAL AND FREQUENCY-DOMAIN DEEPFAKE VIDEO DETECTION USING EFFICIENTNET-B4 AND DISCRETE COSINE TRANSFORM (DCT)</w:t>
+      </w:r>
+    </w:p>
+    <w:p>
+      <w:pPr>
+        <w:spacing w:before="80" w:after="160"/>
+        <w:pBdr>
+          <w:bottom w:val="single" w:sz="12" w:space="1" w:color="B8860B"/>
+        </w:pBdr>
+      </w:pPr>
+    </w:p>
+    <w:p>
+      <w:pPr>
+        <w:spacing w:before="160" w:after="200"/>
         <w:jc w:val="center"/>
       </w:pPr>
       <w:r>
@@ -12,22 +35,7 @@
           <w:rFonts w:ascii="Times New Roman" w:hAnsi="Times New Roman"/>
           <w:b/>
           <w:color w:val="1A365D"/>
-          <w:sz w:val="30"/>
-        </w:rPr>
-        <w:t>DUAL-STREAM SPATIAL AND FREQUENCY-DOMAIN DEEPFAKE VIDEO DETECTION USING EFFICIENTNET-B4 AND DISCRETE COSINE TRANSFORM (DCT)</w:t>
-      </w:r>
-    </w:p>
-    <w:p>
-      <w:pPr>
-        <w:spacing w:before="120" w:after="160"/>
-        <w:jc w:val="center"/>
-      </w:pPr>
-      <w:r>
-        <w:rPr>
-          <w:rFonts w:ascii="Times New Roman" w:hAnsi="Times New Roman"/>
-          <w:b/>
-          <w:color w:val="B41414"/>
-          <w:sz w:val="36"/>
+          <w:sz w:val="34"/>
         </w:rPr>
         <w:t>MINI PROJECT REPORT</w:t>
       </w:r>
@@ -40,7 +48,8 @@
       <w:r>
         <w:rPr>
           <w:rFonts w:ascii="Times New Roman" w:hAnsi="Times New Roman"/>
-          <w:sz w:val="22"/>
+          <w:i/>
+          <w:sz w:val="20"/>
         </w:rPr>
         <w:t>Submitted in partial fulfilment of the requirement for the award of the degree of</w:t>
       </w:r>
@@ -54,6 +63,7 @@
         <w:rPr>
           <w:rFonts w:ascii="Times New Roman" w:hAnsi="Times New Roman"/>
           <w:b/>
+          <w:color w:val="8B0000"/>
           <w:sz w:val="26"/>
         </w:rPr>
         <w:t>Bachelor of Technology</w:t>
@@ -67,7 +77,7 @@
       <w:r>
         <w:rPr>
           <w:rFonts w:ascii="Times New Roman" w:hAnsi="Times New Roman"/>
-          <w:sz w:val="22"/>
+          <w:sz w:val="21"/>
         </w:rPr>
         <w:t>in</w:t>
       </w:r>
@@ -81,20 +91,20 @@
         <w:rPr>
           <w:rFonts w:ascii="Times New Roman" w:hAnsi="Times New Roman"/>
           <w:b/>
+          <w:color w:val="8B0000"/>
           <w:sz w:val="24"/>
         </w:rPr>
-        <w:t>Computer Science &amp; Engineering · AI &amp; ML</w:t>
+        <w:t>Computer Science &amp; Engineering (AIML)</w:t>
       </w:r>
     </w:p>
     <w:p>
       <w:pPr>
-        <w:spacing w:before="40" w:after="40"/>
+        <w:spacing w:before="80" w:after="40"/>
         <w:jc w:val="center"/>
       </w:pPr>
       <w:r>
         <w:rPr>
           <w:rFonts w:ascii="Times New Roman" w:hAnsi="Times New Roman"/>
-          <w:i/>
           <w:sz w:val="20"/>
         </w:rPr>
         <w:t>Submitted to</w:t>
@@ -109,12 +119,50 @@
         <w:rPr>
           <w:rFonts w:ascii="Times New Roman" w:hAnsi="Times New Roman"/>
           <w:b/>
-          <w:color w:val="1A365D"/>
-          <w:sz w:val="24"/>
+          <w:color w:val="000000"/>
+          <w:sz w:val="21"/>
         </w:rPr>
-        <w:t>DR. A.P.J. ABDUL KALAM TECHNICAL UNIVERSITY,</w:t>
-        <w:br/>
-        <w:t>UTTAR PRADESH, LUCKNOW</w:t>
+        <w:t>DR. A.P.J. ABDUL KALAM TECHNICAL UNIVERSITY, UTTAR PRADESH, LUCKNOW</w:t>
+      </w:r>
+    </w:p>
+    <w:p>
+      <w:pPr>
+        <w:spacing w:before="80" w:after="240"/>
+        <w:jc w:val="center"/>
+      </w:pPr>
+      <w:r>
+        <w:drawing>
+          <wp:inline xmlns:a="http://schemas.openxmlformats.org/drawingml/2006/main" xmlns:pic="http://schemas.openxmlformats.org/drawingml/2006/picture">
+            <wp:extent cx="1005840" cy="1005840"/>
+            <wp:docPr id="1" name="Picture 1"/>
+            <wp:cNvGraphicFramePr>
+              <a:graphicFrameLocks noChangeAspect="1"/>
+            </wp:cNvGraphicFramePr>
+            <a:graphic>
+              <a:graphicData uri="http://schemas.openxmlformats.org/drawingml/2006/picture">
+                <pic:pic>
+                  <pic:nvPicPr>
+                    <pic:cNvPr id="0" name="image1.png"/>
+                    <pic:cNvPicPr/>
+                  </pic:nvPicPr>
+                  <pic:blipFill>
+                    <a:blip r:embed="rId9"/>
+                    <a:stretch>
+                      <a:fillRect/>
+                    </a:stretch>
+                  </pic:blipFill>
+                  <pic:spPr>
+                    <a:xfrm>
+                      <a:off x="0" y="0"/>
+                      <a:ext cx="1005840" cy="1005840"/>
+                    </a:xfrm>
+                    <a:prstGeom prst="rect"/>
+                  </pic:spPr>
+                </pic:pic>
+              </a:graphicData>
+            </a:graphic>
+          </wp:inline>
+        </w:drawing>
       </w:r>
     </w:p>
     <w:tbl>
@@ -130,7 +178,7 @@
       <w:tr>
         <w:tc>
           <w:tcPr>
-            <w:tcW w:type="dxa" w:w="4032"/>
+            <w:tcW w:type="dxa" w:w="4320"/>
             <w:tcBorders>
               <w:top w:val="none"/>
               <w:left w:val="none"/>
@@ -140,47 +188,47 @@
           </w:tcPr>
           <w:p>
             <w:pPr>
-              <w:jc w:val="center"/>
-            </w:pPr>
-            <w:r>
-              <w:drawing>
-                <wp:inline xmlns:a="http://schemas.openxmlformats.org/drawingml/2006/main" xmlns:pic="http://schemas.openxmlformats.org/drawingml/2006/picture">
-                  <wp:extent cx="1097280" cy="1097280"/>
-                  <wp:docPr id="1" name="Picture 1"/>
-                  <wp:cNvGraphicFramePr>
-                    <a:graphicFrameLocks noChangeAspect="1"/>
-                  </wp:cNvGraphicFramePr>
-                  <a:graphic>
-                    <a:graphicData uri="http://schemas.openxmlformats.org/drawingml/2006/picture">
-                      <pic:pic>
-                        <pic:nvPicPr>
-                          <pic:cNvPr id="0" name="image1.png"/>
-                          <pic:cNvPicPr/>
-                        </pic:nvPicPr>
-                        <pic:blipFill>
-                          <a:blip r:embed="rId9"/>
-                          <a:stretch>
-                            <a:fillRect/>
-                          </a:stretch>
-                        </pic:blipFill>
-                        <pic:spPr>
-                          <a:xfrm>
-                            <a:off x="0" y="0"/>
-                            <a:ext cx="1097280" cy="1097280"/>
-                          </a:xfrm>
-                          <a:prstGeom prst="rect"/>
-                        </pic:spPr>
-                      </pic:pic>
-                    </a:graphicData>
-                  </a:graphic>
-                </wp:inline>
-              </w:drawing>
-            </w:r>
-          </w:p>
-        </w:tc>
-        <w:tc>
-          <w:tcPr>
-            <w:tcW w:type="dxa" w:w="4032"/>
+              <w:spacing w:line="276" w:lineRule="auto"/>
+              <w:jc w:val="left"/>
+            </w:pPr>
+            <w:r>
+              <w:rPr>
+                <w:rFonts w:ascii="Times New Roman" w:hAnsi="Times New Roman"/>
+                <w:b/>
+                <w:sz w:val="21"/>
+              </w:rPr>
+              <w:t>Submitted by</w:t>
+              <w:br/>
+            </w:r>
+            <w:r>
+              <w:rPr>
+                <w:rFonts w:ascii="Times New Roman" w:hAnsi="Times New Roman"/>
+                <w:b/>
+                <w:sz w:val="20"/>
+              </w:rPr>
+              <w:t>Dev Rana Kaila</w:t>
+              <w:br/>
+            </w:r>
+            <w:r>
+              <w:rPr>
+                <w:rFonts w:ascii="Times New Roman" w:hAnsi="Times New Roman"/>
+                <w:sz w:val="20"/>
+              </w:rPr>
+              <w:t>2301531530023</w:t>
+              <w:br/>
+            </w:r>
+            <w:r>
+              <w:rPr>
+                <w:rFonts w:ascii="Times New Roman" w:hAnsi="Times New Roman"/>
+                <w:sz w:val="20"/>
+              </w:rPr>
+              <w:t>AIML</w:t>
+            </w:r>
+          </w:p>
+        </w:tc>
+        <w:tc>
+          <w:tcPr>
+            <w:tcW w:type="dxa" w:w="3888"/>
             <w:tcBorders>
               <w:top w:val="none"/>
               <w:left w:val="none"/>
@@ -190,41 +238,41 @@
           </w:tcPr>
           <w:p>
             <w:pPr>
-              <w:jc w:val="center"/>
-            </w:pPr>
-            <w:r>
-              <w:drawing>
-                <wp:inline xmlns:a="http://schemas.openxmlformats.org/drawingml/2006/main" xmlns:pic="http://schemas.openxmlformats.org/drawingml/2006/picture">
-                  <wp:extent cx="1097280" cy="1090061"/>
-                  <wp:docPr id="2" name="Picture 2"/>
-                  <wp:cNvGraphicFramePr>
-                    <a:graphicFrameLocks noChangeAspect="1"/>
-                  </wp:cNvGraphicFramePr>
-                  <a:graphic>
-                    <a:graphicData uri="http://schemas.openxmlformats.org/drawingml/2006/picture">
-                      <pic:pic>
-                        <pic:nvPicPr>
-                          <pic:cNvPr id="0" name="image2.png"/>
-                          <pic:cNvPicPr/>
-                        </pic:nvPicPr>
-                        <pic:blipFill>
-                          <a:blip r:embed="rId10"/>
-                          <a:stretch>
-                            <a:fillRect/>
-                          </a:stretch>
-                        </pic:blipFill>
-                        <pic:spPr>
-                          <a:xfrm>
-                            <a:off x="0" y="0"/>
-                            <a:ext cx="1097280" cy="1090061"/>
-                          </a:xfrm>
-                          <a:prstGeom prst="rect"/>
-                        </pic:spPr>
-                      </pic:pic>
-                    </a:graphicData>
-                  </a:graphic>
-                </wp:inline>
-              </w:drawing>
+              <w:spacing w:line="276" w:lineRule="auto"/>
+              <w:jc w:val="right"/>
+            </w:pPr>
+            <w:r>
+              <w:rPr>
+                <w:rFonts w:ascii="Times New Roman" w:hAnsi="Times New Roman"/>
+                <w:b/>
+                <w:sz w:val="21"/>
+              </w:rPr>
+              <w:t>Under the Supervision of</w:t>
+              <w:br/>
+            </w:r>
+            <w:r>
+              <w:rPr>
+                <w:rFonts w:ascii="Times New Roman" w:hAnsi="Times New Roman"/>
+                <w:b/>
+                <w:sz w:val="20"/>
+              </w:rPr>
+              <w:t>Dr. Devendra Gautam</w:t>
+              <w:br/>
+            </w:r>
+            <w:r>
+              <w:rPr>
+                <w:rFonts w:ascii="Times New Roman" w:hAnsi="Times New Roman"/>
+                <w:sz w:val="20"/>
+              </w:rPr>
+              <w:t>Associate Professor</w:t>
+              <w:br/>
+            </w:r>
+            <w:r>
+              <w:rPr>
+                <w:rFonts w:ascii="Times New Roman" w:hAnsi="Times New Roman"/>
+                <w:sz w:val="20"/>
+              </w:rPr>
+              <w:t>Dept. of CSE</w:t>
             </w:r>
           </w:p>
         </w:tc>
@@ -232,129 +280,64 @@
     </w:tbl>
     <w:p>
       <w:pPr>
-        <w:spacing w:before="160"/>
+        <w:spacing w:before="200" w:after="160"/>
+        <w:jc w:val="center"/>
       </w:pPr>
+      <w:r>
+        <w:drawing>
+          <wp:inline xmlns:a="http://schemas.openxmlformats.org/drawingml/2006/main" xmlns:pic="http://schemas.openxmlformats.org/drawingml/2006/picture">
+            <wp:extent cx="914400" cy="908384"/>
+            <wp:docPr id="2" name="Picture 2"/>
+            <wp:cNvGraphicFramePr>
+              <a:graphicFrameLocks noChangeAspect="1"/>
+            </wp:cNvGraphicFramePr>
+            <a:graphic>
+              <a:graphicData uri="http://schemas.openxmlformats.org/drawingml/2006/picture">
+                <pic:pic>
+                  <pic:nvPicPr>
+                    <pic:cNvPr id="0" name="image2.png"/>
+                    <pic:cNvPicPr/>
+                  </pic:nvPicPr>
+                  <pic:blipFill>
+                    <a:blip r:embed="rId10"/>
+                    <a:stretch>
+                      <a:fillRect/>
+                    </a:stretch>
+                  </pic:blipFill>
+                  <pic:spPr>
+                    <a:xfrm>
+                      <a:off x="0" y="0"/>
+                      <a:ext cx="914400" cy="908384"/>
+                    </a:xfrm>
+                    <a:prstGeom prst="rect"/>
+                  </pic:spPr>
+                </pic:pic>
+              </a:graphicData>
+            </a:graphic>
+          </wp:inline>
+        </w:drawing>
+      </w:r>
     </w:p>
-    <w:tbl>
-      <w:tblPr>
-        <w:tblW w:type="auto" w:w="0"/>
-        <w:jc w:val="center"/>
-        <w:tblLook w:firstColumn="1" w:firstRow="1" w:lastColumn="0" w:lastRow="0" w:noHBand="0" w:noVBand="1" w:val="04A0"/>
-      </w:tblPr>
-      <w:tblGrid>
-        <w:gridCol w:w="4154"/>
-        <w:gridCol w:w="4154"/>
-      </w:tblGrid>
-      <w:tr>
-        <w:tc>
-          <w:tcPr>
-            <w:tcW w:type="dxa" w:w="4032"/>
-            <w:tcBorders>
-              <w:top w:val="none"/>
-              <w:left w:val="none"/>
-              <w:bottom w:val="none"/>
-              <w:right w:val="none"/>
-            </w:tcBorders>
-          </w:tcPr>
-          <w:p>
-            <w:pPr>
-              <w:spacing w:line="276" w:lineRule="auto"/>
-            </w:pPr>
-            <w:r>
-              <w:rPr>
-                <w:rFonts w:ascii="Times New Roman" w:hAnsi="Times New Roman"/>
-                <w:i/>
-                <w:sz w:val="21"/>
-              </w:rPr>
-              <w:t>Submitted by:</w:t>
-              <w:br/>
-            </w:r>
-            <w:r>
-              <w:rPr>
-                <w:rFonts w:ascii="Times New Roman" w:hAnsi="Times New Roman"/>
-                <w:b/>
-                <w:sz w:val="22"/>
-              </w:rPr>
-              <w:t>Dev Rana Kaila</w:t>
-              <w:br/>
-            </w:r>
-            <w:r>
-              <w:rPr>
-                <w:rFonts w:ascii="Times New Roman" w:hAnsi="Times New Roman"/>
-                <w:sz w:val="20"/>
-              </w:rPr>
-              <w:t>Roll No.: 2301531530023</w:t>
-              <w:br/>
-              <w:t>Semester &amp; Section: 7th, A</w:t>
-            </w:r>
-          </w:p>
-        </w:tc>
-        <w:tc>
-          <w:tcPr>
-            <w:tcW w:type="dxa" w:w="4032"/>
-            <w:tcBorders>
-              <w:top w:val="none"/>
-              <w:left w:val="none"/>
-              <w:bottom w:val="none"/>
-              <w:right w:val="none"/>
-            </w:tcBorders>
-          </w:tcPr>
-          <w:p>
-            <w:pPr>
-              <w:spacing w:line="276" w:lineRule="auto"/>
-              <w:jc w:val="right"/>
-            </w:pPr>
-            <w:r>
-              <w:rPr>
-                <w:rFonts w:ascii="Times New Roman" w:hAnsi="Times New Roman"/>
-                <w:i/>
-                <w:sz w:val="21"/>
-              </w:rPr>
-              <w:t>Under the Supervision of:</w:t>
-              <w:br/>
-            </w:r>
-            <w:r>
-              <w:rPr>
-                <w:rFonts w:ascii="Times New Roman" w:hAnsi="Times New Roman"/>
-                <w:b/>
-                <w:sz w:val="22"/>
-              </w:rPr>
-              <w:t>Dr. Devendra Gautam</w:t>
-              <w:br/>
-            </w:r>
-            <w:r>
-              <w:rPr>
-                <w:rFonts w:ascii="Times New Roman" w:hAnsi="Times New Roman"/>
-                <w:sz w:val="20"/>
-              </w:rPr>
-              <w:t>Associate Professor</w:t>
-              <w:br/>
-              <w:t>Dept. of CSE, LIET</w:t>
-            </w:r>
-          </w:p>
-        </w:tc>
-      </w:tr>
-    </w:tbl>
     <w:p>
       <w:pPr>
-        <w:spacing w:before="320" w:after="40" w:line="276" w:lineRule="auto"/>
+        <w:spacing w:before="80" w:after="40" w:line="276" w:lineRule="auto"/>
         <w:jc w:val="center"/>
       </w:pPr>
       <w:r>
         <w:rPr>
           <w:rFonts w:ascii="Times New Roman" w:hAnsi="Times New Roman"/>
           <w:b/>
-          <w:sz w:val="22"/>
+          <w:sz w:val="21"/>
         </w:rPr>
-        <w:t>Department of Computer Science &amp; Engineering &amp; Allied Branches</w:t>
+        <w:t>Department of Computer Science &amp; Engineering</w:t>
         <w:br/>
       </w:r>
       <w:r>
         <w:rPr>
           <w:rFonts w:ascii="Times New Roman" w:hAnsi="Times New Roman"/>
           <w:b/>
-          <w:color w:val="1A365D"/>
-          <w:sz w:val="24"/>
+          <w:color w:val="8B0000"/>
+          <w:sz w:val="23"/>
         </w:rPr>
         <w:t>Lloyd Institute of Engineering &amp; Technology</w:t>
         <w:br/>
@@ -362,18 +345,32 @@
       <w:r>
         <w:rPr>
           <w:rFonts w:ascii="Times New Roman" w:hAnsi="Times New Roman"/>
-          <w:sz w:val="19"/>
+          <w:sz w:val="18"/>
         </w:rPr>
         <w:t>Plot No. 3, Knowledge Park II, Greater Noida, Uttar Pradesh 201306</w:t>
         <w:br/>
       </w:r>
+    </w:p>
+    <w:p>
+      <w:pPr>
+        <w:spacing w:before="80" w:after="160"/>
+        <w:pBdr>
+          <w:bottom w:val="single" w:sz="12" w:space="1" w:color="B8860B"/>
+        </w:pBdr>
+      </w:pPr>
+    </w:p>
+    <w:p>
+      <w:pPr>
+        <w:spacing w:before="40" w:after="0"/>
+        <w:jc w:val="center"/>
+      </w:pPr>
       <w:r>
         <w:rPr>
           <w:rFonts w:ascii="Times New Roman" w:hAnsi="Times New Roman"/>
           <w:b/>
           <w:sz w:val="21"/>
         </w:rPr>
-        <w:t>Session: 2026–27</w:t>
+        <w:t>Session: 2026-27</w:t>
       </w:r>
     </w:p>
     <w:p>
@@ -420,7 +417,7 @@
           <w:color w:val="000000"/>
           <w:sz w:val="22"/>
         </w:rPr>
-        <w:t>This is to certify that the Mini Project Report entitled “Dual-Stream Spatial and Frequency-Domain Deepfake Video Detection using EfficientNet-B4 and Discrete Cosine Transform (DCT)” is a bonafide work carried out by Dev Rana Kaila (Roll No. 2301531530023) in partial fulfilment of the requirements for the award of the degree of Bachelor of Technology in Computer Science &amp; Engineering (AIML) during the academic year 2026–27, 4th Year, at the Department of Computer Science &amp; Engineering &amp; Allied Branches, Lloyd Institute of Engineering &amp; Technology.</w:t>
+        <w:t>This is to certify that the Mini Project Report entitled "Dual-Stream Spatial and Frequency-Domain Deepfake Video Detection using EfficientNet-B4 and Discrete Cosine Transform (DCT)" is a bonafide work carried out by Dev Rana Kaila (Roll No. 2301531530023) in partial fulfilment of the requirements for the award of the degree of Bachelor of Technology in Computer Science &amp; Engineering (AIML) during the academic year 2026-27, 4th Year, at the Department of Computer Science &amp; Engineering &amp; Allied Branches, Lloyd Institute of Engineering &amp; Technology.</w:t>
       </w:r>
     </w:p>
     <w:p>
@@ -439,7 +436,7 @@
     </w:p>
     <w:p>
       <w:pPr>
-        <w:spacing w:before="800"/>
+        <w:spacing w:before="900"/>
       </w:pPr>
     </w:p>
     <w:tbl>
@@ -649,7 +646,7 @@
           <w:color w:val="000000"/>
           <w:sz w:val="22"/>
         </w:rPr>
-        <w:t>I hereby declare that the Mini Project Report entitled “Dual-Stream Spatial and Frequency-Domain Deepfake Video Detection using EfficientNet-B4 and Discrete Cosine Transform (DCT)” submitted to the Department of Computer Science &amp; Engineering &amp; Allied Branches, Lloyd Institute of Engineering &amp; Technology, in partial fulfilment of the requirements for the degree of Bachelor of Technology in Computer Science &amp; Engineering (AIML), is a record of original work carried out by me under the guidance and supervision of Dr. Devendra Gautam, Associate Professor.</w:t>
+        <w:t>I hereby declare that the Mini Project Report entitled "Dual-Stream Spatial and Frequency-Domain Deepfake Video Detection using EfficientNet-B4 and Discrete Cosine Transform (DCT)" submitted to the Department of Computer Science &amp; Engineering &amp; Allied Branches, Lloyd Institute of Engineering &amp; Technology, in partial fulfilment of the requirements for the degree of Bachelor of Technology in Computer Science &amp; Engineering (AIML), is a record of original work carried out by me under the guidance and supervision of Dr. Devendra Gautam, Associate Professor.</w:t>
       </w:r>
     </w:p>
     <w:p>
@@ -831,7 +828,7 @@
           <w:color w:val="000000"/>
           <w:sz w:val="22"/>
         </w:rPr>
-        <w:t>The rapid emergence of deep generative modeling, specifically Generative Adversarial Networks (GANs), Variational Autoencoders (VAEs), and Latent Diffusion Models (LDMs), has made the synthesis of hyper-realistic facial media (deepfakes) ubiquitous. While offering creative utilities in visual effects and digital avatars, deepfakes present acute threats to automated biometric authentication, financial KYC verification, executive communications, and democratic integrity. Conventional deepfake detection architectures rely predominantly on single-stream RGB spatial convolutional networks that attempt to localize visible pixel flaws such as warping or boundary blending. However, spatial detectors suffer devastating accuracy degradation (often losing 20–35% accuracy) when subjected to real-world social media video compression (e.g., H.264/H.265 codecs) and downsampling.</w:t>
+        <w:t>The rapid emergence of deep generative modeling, specifically Generative Adversarial Networks (GANs), Variational Autoencoders (VAEs), and Latent Diffusion Models (LDMs), has made the synthesis of hyper-realistic facial media (deepfakes) ubiquitous. While offering creative utilities in visual effects and digital avatars, deepfakes present acute threats to automated biometric authentication, financial KYC verification, executive communications, and democratic integrity. Conventional deepfake detection architectures rely predominantly on single-stream RGB spatial convolutional networks that attempt to localize visible pixel flaws such as warping or boundary blending. However, spatial detectors suffer devastating accuracy degradation (often losing 20-35% accuracy) when subjected to real-world social media video compression (e.g., H.264/H.265 codecs) and downsampling.</w:t>
       </w:r>
     </w:p>
     <w:p>
@@ -13801,7 +13798,7 @@
       <w:r>
         <w:drawing>
           <wp:inline xmlns:a="http://schemas.openxmlformats.org/drawingml/2006/main" xmlns:pic="http://schemas.openxmlformats.org/drawingml/2006/picture">
-            <wp:extent cx="4937760" cy="2794145"/>
+            <wp:extent cx="4937760" cy="3086100"/>
             <wp:docPr id="3" name="Picture 3"/>
             <wp:cNvGraphicFramePr>
               <a:graphicFrameLocks noChangeAspect="1"/>
@@ -13822,7 +13819,7 @@
                   <pic:spPr>
                     <a:xfrm>
                       <a:off x="0" y="0"/>
-                      <a:ext cx="4937760" cy="2794145"/>
+                      <a:ext cx="4937760" cy="3086100"/>
                     </a:xfrm>
                     <a:prstGeom prst="rect"/>
                   </pic:spPr>
@@ -13925,7 +13922,7 @@
       <w:r>
         <w:drawing>
           <wp:inline xmlns:a="http://schemas.openxmlformats.org/drawingml/2006/main" xmlns:pic="http://schemas.openxmlformats.org/drawingml/2006/picture">
-            <wp:extent cx="4754880" cy="2690658"/>
+            <wp:extent cx="4754880" cy="2852928"/>
             <wp:docPr id="4" name="Picture 4"/>
             <wp:cNvGraphicFramePr>
               <a:graphicFrameLocks noChangeAspect="1"/>
@@ -13946,7 +13943,7 @@
                   <pic:spPr>
                     <a:xfrm>
                       <a:off x="0" y="0"/>
-                      <a:ext cx="4754880" cy="2690658"/>
+                      <a:ext cx="4754880" cy="2852928"/>
                     </a:xfrm>
                     <a:prstGeom prst="rect"/>
                   </pic:spPr>
@@ -14003,7 +14000,7 @@
       <w:r>
         <w:drawing>
           <wp:inline xmlns:a="http://schemas.openxmlformats.org/drawingml/2006/main" xmlns:pic="http://schemas.openxmlformats.org/drawingml/2006/picture">
-            <wp:extent cx="4846320" cy="2953630"/>
+            <wp:extent cx="4846320" cy="3230880"/>
             <wp:docPr id="5" name="Picture 5"/>
             <wp:cNvGraphicFramePr>
               <a:graphicFrameLocks noChangeAspect="1"/>
@@ -14024,7 +14021,7 @@
                   <pic:spPr>
                     <a:xfrm>
                       <a:off x="0" y="0"/>
-                      <a:ext cx="4846320" cy="2953630"/>
+                      <a:ext cx="4846320" cy="3230880"/>
                     </a:xfrm>
                     <a:prstGeom prst="rect"/>
                   </pic:spPr>
@@ -14097,7 +14094,7 @@
       <w:r>
         <w:drawing>
           <wp:inline xmlns:a="http://schemas.openxmlformats.org/drawingml/2006/main" xmlns:pic="http://schemas.openxmlformats.org/drawingml/2006/picture">
-            <wp:extent cx="4846320" cy="2806166"/>
+            <wp:extent cx="4846320" cy="3028950"/>
             <wp:docPr id="6" name="Picture 6"/>
             <wp:cNvGraphicFramePr>
               <a:graphicFrameLocks noChangeAspect="1"/>
@@ -14118,7 +14115,7 @@
                   <pic:spPr>
                     <a:xfrm>
                       <a:off x="0" y="0"/>
-                      <a:ext cx="4846320" cy="2806166"/>
+                      <a:ext cx="4846320" cy="3028950"/>
                     </a:xfrm>
                     <a:prstGeom prst="rect"/>
                   </pic:spPr>
@@ -14175,7 +14172,7 @@
       <w:r>
         <w:drawing>
           <wp:inline xmlns:a="http://schemas.openxmlformats.org/drawingml/2006/main" xmlns:pic="http://schemas.openxmlformats.org/drawingml/2006/picture">
-            <wp:extent cx="4754880" cy="2616927"/>
+            <wp:extent cx="4754880" cy="2809702"/>
             <wp:docPr id="7" name="Picture 7"/>
             <wp:cNvGraphicFramePr>
               <a:graphicFrameLocks noChangeAspect="1"/>
@@ -14196,7 +14193,7 @@
                   <pic:spPr>
                     <a:xfrm>
                       <a:off x="0" y="0"/>
-                      <a:ext cx="4754880" cy="2616927"/>
+                      <a:ext cx="4754880" cy="2809702"/>
                     </a:xfrm>
                     <a:prstGeom prst="rect"/>
                   </pic:spPr>
@@ -20702,7 +20699,7 @@
       <w:r>
         <w:drawing>
           <wp:inline xmlns:a="http://schemas.openxmlformats.org/drawingml/2006/main" xmlns:pic="http://schemas.openxmlformats.org/drawingml/2006/picture">
-            <wp:extent cx="4846320" cy="2423160"/>
+            <wp:extent cx="4846320" cy="2665476"/>
             <wp:docPr id="10" name="Picture 10"/>
             <wp:cNvGraphicFramePr>
               <a:graphicFrameLocks noChangeAspect="1"/>
@@ -20723,7 +20720,7 @@
                   <pic:spPr>
                     <a:xfrm>
                       <a:off x="0" y="0"/>
-                      <a:ext cx="4846320" cy="2423160"/>
+                      <a:ext cx="4846320" cy="2665476"/>
                     </a:xfrm>
                     <a:prstGeom prst="rect"/>
                   </pic:spPr>
@@ -26562,7 +26559,7 @@
       <w:r>
         <w:drawing>
           <wp:inline xmlns:a="http://schemas.openxmlformats.org/drawingml/2006/main" xmlns:pic="http://schemas.openxmlformats.org/drawingml/2006/picture">
-            <wp:extent cx="4937760" cy="2468880"/>
+            <wp:extent cx="4937760" cy="2715768"/>
             <wp:docPr id="13" name="Picture 13"/>
             <wp:cNvGraphicFramePr>
               <a:graphicFrameLocks noChangeAspect="1"/>
@@ -26583,7 +26580,7 @@
                   <pic:spPr>
                     <a:xfrm>
                       <a:off x="0" y="0"/>
-                      <a:ext cx="4937760" cy="2468880"/>
+                      <a:ext cx="4937760" cy="2715768"/>
                     </a:xfrm>
                     <a:prstGeom prst="rect"/>
                   </pic:spPr>
@@ -30404,103 +30401,20 @@
   <w:p>
     <w:pPr>
       <w:pStyle w:val="Footer"/>
+      <w:jc w:val="center"/>
     </w:pPr>
+    <w:r>
+      <w:rPr>
+        <w:rFonts w:ascii="Times New Roman" w:hAnsi="Times New Roman"/>
+        <w:color w:val="2D3748"/>
+        <w:sz w:val="20"/>
+      </w:rPr>
+      <w:fldChar w:fldCharType="begin"/>
+      <w:instrText xml:space="preserve"> PAGE </w:instrText>
+      <w:fldChar w:fldCharType="separate"/>
+      <w:fldChar w:fldCharType="end"/>
+    </w:r>
   </w:p>
-  <w:tbl>
-    <w:tblPr>
-      <w:tblW w:type="auto" w:w="0"/>
-      <w:jc w:val="center"/>
-      <w:tblLook w:firstColumn="1" w:firstRow="1" w:lastColumn="0" w:lastRow="0" w:noHBand="0" w:noVBand="1" w:val="04A0"/>
-    </w:tblPr>
-    <w:tblGrid>
-      <w:gridCol w:w="2770"/>
-      <w:gridCol w:w="2770"/>
-      <w:gridCol w:w="2770"/>
-    </w:tblGrid>
-    <w:tr>
-      <w:tc>
-        <w:tcPr>
-          <w:tcW w:type="dxa" w:w="1440"/>
-          <w:tcMar>
-            <w:top w:w="60" w:type="dxa"/>
-            <w:bottom w:w="60" w:type="dxa"/>
-            <w:left w:w="40" w:type="dxa"/>
-            <w:right w:w="40" w:type="dxa"/>
-          </w:tcMar>
-          <w:tcBorders>
-            <w:top w:val="none"/>
-            <w:left w:val="none"/>
-            <w:bottom w:val="none"/>
-            <w:right w:val="none"/>
-          </w:tcBorders>
-        </w:tcPr>
-        <w:p/>
-      </w:tc>
-      <w:tc>
-        <w:tcPr>
-          <w:tcW w:type="dxa" w:w="5429"/>
-          <w:tcMar>
-            <w:top w:w="60" w:type="dxa"/>
-            <w:bottom w:w="60" w:type="dxa"/>
-            <w:left w:w="40" w:type="dxa"/>
-            <w:right w:w="40" w:type="dxa"/>
-          </w:tcMar>
-          <w:tcBorders>
-            <w:top w:val="none"/>
-            <w:left w:val="none"/>
-            <w:bottom w:val="none"/>
-            <w:right w:val="none"/>
-          </w:tcBorders>
-        </w:tcPr>
-        <w:p>
-          <w:pPr>
-            <w:jc w:val="center"/>
-          </w:pPr>
-          <w:r>
-            <w:rPr>
-              <w:rFonts w:ascii="Times New Roman" w:hAnsi="Times New Roman"/>
-              <w:color w:val="718096"/>
-              <w:sz w:val="18"/>
-            </w:rPr>
-            <w:t>LIET, Greater Noida — Dept. of CSE (AIML)</w:t>
-          </w:r>
-        </w:p>
-      </w:tc>
-      <w:tc>
-        <w:tcPr>
-          <w:tcW w:type="dxa" w:w="1440"/>
-          <w:tcMar>
-            <w:top w:w="60" w:type="dxa"/>
-            <w:bottom w:w="60" w:type="dxa"/>
-            <w:left w:w="40" w:type="dxa"/>
-            <w:right w:w="40" w:type="dxa"/>
-          </w:tcMar>
-          <w:tcBorders>
-            <w:top w:val="none"/>
-            <w:left w:val="none"/>
-            <w:bottom w:val="none"/>
-            <w:right w:val="none"/>
-          </w:tcBorders>
-        </w:tcPr>
-        <w:p>
-          <w:pPr>
-            <w:jc w:val="right"/>
-          </w:pPr>
-          <w:r>
-            <w:rPr>
-              <w:rFonts w:ascii="Times New Roman" w:hAnsi="Times New Roman"/>
-              <w:color w:val="2D3748"/>
-              <w:sz w:val="19"/>
-            </w:rPr>
-            <w:fldChar w:fldCharType="begin"/>
-            <w:instrText xml:space="preserve"> PAGE </w:instrText>
-            <w:fldChar w:fldCharType="separate"/>
-            <w:fldChar w:fldCharType="end"/>
-          </w:r>
-        </w:p>
-      </w:tc>
-    </w:tr>
-  </w:tbl>
 </w:ftr>
 </file>
 

</xml_diff>